<commit_message>
docs: rebuild submission — project-plan diagram now embedded in Section 11
The rebuild had been blocked since 6 Aug because the docx was open in Word.
Both diagrams are now in the document: the user-flow diagram in 21.3 and the
phases-and-milestones diagram in Section 11.

Co-Authored-By: Claude Opus 5 (1M context) <noreply@anthropic.com>
</commit_message>
<xml_diff>
--- a/docs/TripME_Phase2_Submission.docx
+++ b/docs/TripME_Phase2_Submission.docx
@@ -17513,6 +17513,58 @@
     </w:p>
     <w:p>
       <w:pPr>
+        <w:jc w:val="center"/>
+      </w:pPr>
+      <w:r>
+        <w:drawing>
+          <wp:inline xmlns:a="http://schemas.openxmlformats.org/drawingml/2006/main" xmlns:pic="http://schemas.openxmlformats.org/drawingml/2006/picture">
+            <wp:extent cx="4937760" cy="6419088"/>
+            <wp:docPr id="1" name="Picture 1"/>
+            <wp:cNvGraphicFramePr>
+              <a:graphicFrameLocks noChangeAspect="1"/>
+            </wp:cNvGraphicFramePr>
+            <a:graphic>
+              <a:graphicData uri="http://schemas.openxmlformats.org/drawingml/2006/picture">
+                <pic:pic>
+                  <pic:nvPicPr>
+                    <pic:cNvPr id="0" name="project-plan.png"/>
+                    <pic:cNvPicPr/>
+                  </pic:nvPicPr>
+                  <pic:blipFill>
+                    <a:blip r:embed="rId9"/>
+                    <a:stretch>
+                      <a:fillRect/>
+                    </a:stretch>
+                  </pic:blipFill>
+                  <pic:spPr>
+                    <a:xfrm>
+                      <a:off x="0" y="0"/>
+                      <a:ext cx="4937760" cy="6419088"/>
+                    </a:xfrm>
+                    <a:prstGeom prst="rect"/>
+                  </pic:spPr>
+                </pic:pic>
+              </a:graphicData>
+            </a:graphic>
+          </wp:inline>
+        </w:drawing>
+      </w:r>
+    </w:p>
+    <w:p>
+      <w:pPr>
+        <w:spacing w:after="120"/>
+      </w:pPr>
+      <w:r>
+        <w:rPr>
+          <w:b w:val="0"/>
+          <w:i/>
+          <w:sz w:val="18"/>
+        </w:rPr>
+        <w:t>The plan as a flow. Dark nodes are the executed sprints; Sprint 7 is marked in marigold because it was added on evidence rather than planned; the two checkpoints mark the earliest moments the core hypothesis and the full pipeline could be validated; Monitoring &amp; Controlling ran throughout and is shown once. The table above remains the source of truth.</w:t>
+      </w:r>
+    </w:p>
+    <w:p>
+      <w:pPr>
         <w:pStyle w:val="Heading2"/>
       </w:pPr>
       <w:r>
@@ -25460,7 +25512,7 @@
         <w:drawing>
           <wp:inline xmlns:a="http://schemas.openxmlformats.org/drawingml/2006/main" xmlns:pic="http://schemas.openxmlformats.org/drawingml/2006/picture">
             <wp:extent cx="6035040" cy="3340826"/>
-            <wp:docPr id="1" name="Picture 1"/>
+            <wp:docPr id="2" name="Picture 2"/>
             <wp:cNvGraphicFramePr>
               <a:graphicFrameLocks noChangeAspect="1"/>
             </wp:cNvGraphicFramePr>
@@ -25472,7 +25524,7 @@
                     <pic:cNvPicPr/>
                   </pic:nvPicPr>
                   <pic:blipFill>
-                    <a:blip r:embed="rId9"/>
+                    <a:blip r:embed="rId10"/>
                     <a:stretch>
                       <a:fillRect/>
                     </a:stretch>

</xml_diff>